<commit_message>
Refresh sample document fixture
</commit_message>
<xml_diff>
--- a/sample.docx
+++ b/sample.docx
@@ -3,408 +3,12 @@
 <w:document xmlns:wp14="http://schemas.microsoft.com/office/word/2010/wordprocessingDrawing" xmlns:mc="http://schemas.openxmlformats.org/markup-compatibility/2006" xmlns:o="urn:schemas-microsoft-com:office:office" xmlns:r="http://schemas.openxmlformats.org/officeDocument/2006/relationships" xmlns:m="http://schemas.openxmlformats.org/officeDocument/2006/math" xmlns:v="urn:schemas-microsoft-com:vml" xmlns:wp="http://schemas.openxmlformats.org/drawingml/2006/wordprocessingDrawing" xmlns:w10="urn:schemas-microsoft-com:office:word" xmlns:w="http://schemas.openxmlformats.org/wordprocessingml/2006/main" xmlns:wne="http://schemas.microsoft.com/office/word/2006/wordml" xmlns:sl="http://schemas.openxmlformats.org/schemaLibrary/2006/main" xmlns:a="http://schemas.openxmlformats.org/drawingml/2006/main" xmlns:pic="http://schemas.openxmlformats.org/drawingml/2006/picture" xmlns:c="http://schemas.openxmlformats.org/drawingml/2006/chart" xmlns:lc="http://schemas.openxmlformats.org/drawingml/2006/lockedCanvas" xmlns:dgm="http://schemas.openxmlformats.org/drawingml/2006/diagram" xmlns:wps="http://schemas.microsoft.com/office/word/2010/wordprocessingShape" xmlns:wpg="http://schemas.microsoft.com/office/word/2010/wordprocessingGroup" xmlns:w14="http://schemas.microsoft.com/office/word/2010/wordml" xmlns:w15="http://schemas.microsoft.com/office/word/2012/wordml" xmlns:w16="http://schemas.microsoft.com/office/word/2018/wordml" xmlns:w16cex="http://schemas.microsoft.com/office/word/2018/wordml/cex" xmlns:w16cid="http://schemas.microsoft.com/office/word/2016/wordml/cid" xmlns="http://schemas.microsoft.com/office/tasks/2019/documenttasks" xmlns:cr="http://schemas.microsoft.com/office/comments/2020/reactions" mc:Ignorable="wp14">
   <w:background w:color="FFFFFF"/>
   <w:body>
-    <w:p xmlns:wp14="http://schemas.microsoft.com/office/word/2010/wordml" wp14:textId="77777777">
-      <w:pPr>
-        <w:pStyle w:val="Heading1"/>
-      </w:pPr>
-      <w:bookmarkStart w:name="_lmthzyxmwq7" w:id="0"/>
-      <w:bookmarkEnd w:id="0"/>
-      <w:r>
-        <w:rPr>
-          <w:rFonts w:ascii="Arial Unicode MS" w:hAnsi="Arial Unicode MS" w:eastAsia="Arial Unicode MS" w:cs="Arial Unicode MS"/>
-          <w:lang w:val="en-US"/>
-        </w:rPr>
-        <w:t>빌파 실행법</w:t>
-      </w:r>
-    </w:p>
-    <w:p xmlns:wp14="http://schemas.microsoft.com/office/word/2010/wordml" wp14:textId="77777777">
-      <w:pPr>
-        <w:rPr/>
-      </w:pPr>
-      <w:r>
-        <w:rPr>
-          <w:rtl w:val="0"/>
-        </w:rPr>
-      </w:r>
-    </w:p>
-    <w:p xmlns:wp14="http://schemas.microsoft.com/office/word/2010/wordml" wp14:textId="77777777">
-      <w:pPr>
-        <w:numPr>
-          <w:ilvl w:val="0"/>
-          <w:numId w:val="1"/>
-        </w:numPr>
-        <w:ind w:left="720" w:hanging="360"/>
-        <w:rPr>
-          <w:u w:val="none"/>
-          <w:lang w:val="en-US"/>
-        </w:rPr>
-      </w:pPr>
-      <w:r>
-        <w:rPr>
-          <w:rFonts w:ascii="Arial Unicode MS" w:hAnsi="Arial Unicode MS" w:eastAsia="Arial Unicode MS" w:cs="Arial Unicode MS"/>
-          <w:lang w:val="en-US"/>
-        </w:rPr>
-        <w:t>에픽게임즈에서 4.26.2 버전 언리얼 엔진을 설치한다.</w:t>
-      </w:r>
-    </w:p>
-    <w:p xmlns:wp14="http://schemas.microsoft.com/office/word/2010/wordml" wp14:textId="77777777">
-      <w:pPr>
-        <w:numPr>
-          <w:ilvl w:val="0"/>
-          <w:numId w:val="1"/>
-        </w:numPr>
-        <w:ind w:left="720" w:hanging="360"/>
-        <w:rPr>
-          <w:u w:val="none"/>
-        </w:rPr>
-      </w:pPr>
-      <w:r>
-        <w:rPr>
-          <w:rFonts w:ascii="Arial Unicode MS" w:hAnsi="Arial Unicode MS" w:eastAsia="Arial Unicode MS" w:cs="Arial Unicode MS"/>
-          <w:rtl w:val="0"/>
-        </w:rPr>
-        <w:t xml:space="preserve">BNF.zip 를 받아 압축을 푼다.</w:t>
-      </w:r>
-    </w:p>
-    <w:p xmlns:wp14="http://schemas.microsoft.com/office/word/2010/wordml" wp14:textId="77777777">
-      <w:pPr>
-        <w:numPr>
-          <w:ilvl w:val="0"/>
-          <w:numId w:val="1"/>
-        </w:numPr>
-        <w:ind w:left="720" w:hanging="360"/>
-        <w:rPr>
-          <w:u w:val="none"/>
-        </w:rPr>
-      </w:pPr>
-      <w:r>
-        <w:rPr>
-          <w:rFonts w:ascii="Arial Unicode MS" w:hAnsi="Arial Unicode MS" w:eastAsia="Arial Unicode MS" w:cs="Arial Unicode MS"/>
-          <w:rtl w:val="0"/>
-        </w:rPr>
-        <w:t xml:space="preserve">UE4Patch.bat 를 실행한다.</w:t>
-      </w:r>
-    </w:p>
-    <w:p xmlns:wp14="http://schemas.microsoft.com/office/word/2010/wordml" wp14:textId="77777777">
-      <w:pPr>
-        <w:numPr>
-          <w:ilvl w:val="0"/>
-          <w:numId w:val="1"/>
-        </w:numPr>
-        <w:ind w:left="720" w:hanging="360"/>
-        <w:rPr>
-          <w:u w:val="none"/>
-        </w:rPr>
-      </w:pPr>
-      <w:r>
-        <w:rPr>
-          <w:rFonts w:ascii="Arial Unicode MS" w:hAnsi="Arial Unicode MS" w:eastAsia="Arial Unicode MS" w:cs="Arial Unicode MS"/>
-          <w:rtl w:val="0"/>
-        </w:rPr>
-        <w:t xml:space="preserve">IUGame.uproject 를 실행한다.</w:t>
-      </w:r>
-    </w:p>
-    <w:p xmlns:wp14="http://schemas.microsoft.com/office/word/2010/wordml" wp14:textId="77777777">
-      <w:pPr>
-        <w:numPr>
-          <w:ilvl w:val="1"/>
-          <w:numId w:val="1"/>
-        </w:numPr>
-        <w:ind w:left="1440" w:hanging="360"/>
-        <w:rPr>
-          <w:u w:val="none"/>
-          <w:lang w:val="en-US"/>
-        </w:rPr>
-      </w:pPr>
-      <w:r>
-        <w:rPr>
-          <w:rFonts w:ascii="Arial Unicode MS" w:hAnsi="Arial Unicode MS" w:eastAsia="Arial Unicode MS" w:cs="Arial Unicode MS"/>
-          <w:lang w:val="en-US"/>
-        </w:rPr>
-        <w:t>이 때 4.26 버전의 언리얼 엔진으로 실행해야 한다.</w:t>
-      </w:r>
-    </w:p>
-    <w:p xmlns:wp14="http://schemas.microsoft.com/office/word/2010/wordml" wp14:textId="77777777">
-      <w:pPr>
-        <w:numPr>
-          <w:ilvl w:val="1"/>
-          <w:numId w:val="1"/>
-        </w:numPr>
-        <w:ind w:left="1440" w:hanging="360"/>
-        <w:rPr>
-          <w:u w:val="none"/>
-          <w:lang w:val="en-US"/>
-        </w:rPr>
-      </w:pPr>
-      <w:r>
-        <w:rPr>
-          <w:rFonts w:ascii="Arial Unicode MS" w:hAnsi="Arial Unicode MS" w:eastAsia="Arial Unicode MS" w:cs="Arial Unicode MS"/>
-          <w:lang w:val="en-US"/>
-        </w:rPr>
-        <w:t>혹시 다른 버전의 언리얼이 깔려있다면 안전한 실행을 위해 에픽 게임즈에서 아래 아이콘을 실행하여 직접 실행하는 것을 추천!</w:t>
-      </w:r>
-    </w:p>
-    <w:p xmlns:wp14="http://schemas.microsoft.com/office/word/2010/wordml" wp14:textId="77777777">
-      <w:pPr>
-        <w:numPr>
-          <w:ilvl w:val="2"/>
-          <w:numId w:val="1"/>
-        </w:numPr>
-        <w:ind w:left="2160" w:hanging="360"/>
-        <w:rPr>
-          <w:u w:val="none"/>
-        </w:rPr>
-      </w:pPr>
-      <w:r>
-        <w:rPr/>
-        <w:drawing>
-          <wp:inline xmlns:wp14="http://schemas.microsoft.com/office/word/2010/wordprocessingDrawing" distT="114300" distB="114300" distL="114300" distR="114300" wp14:anchorId="053344FE" wp14:editId="7777777">
-            <wp:extent cx="2333625" cy="1352550"/>
-            <wp:effectExtent l="0" t="0" r="0" b="0"/>
-            <wp:docPr id="1" name="image1.png"/>
-            <a:graphic>
-              <a:graphicData uri="http://schemas.openxmlformats.org/drawingml/2006/picture">
-                <pic:pic>
-                  <pic:nvPicPr>
-                    <pic:cNvPr id="0" name="image1.png"/>
-                    <pic:cNvPicPr preferRelativeResize="0"/>
-                  </pic:nvPicPr>
-                  <pic:blipFill>
-                    <a:blip r:embed="rId6"/>
-                    <a:srcRect l="0" t="0" r="0" b="0"/>
-                    <a:stretch>
-                      <a:fillRect/>
-                    </a:stretch>
-                  </pic:blipFill>
-                  <pic:spPr>
-                    <a:xfrm>
-                      <a:off x="0" y="0"/>
-                      <a:ext cx="2333625" cy="1352550"/>
-                    </a:xfrm>
-                    <a:prstGeom prst="rect"/>
-                    <a:ln/>
-                  </pic:spPr>
-                </pic:pic>
-              </a:graphicData>
-            </a:graphic>
-          </wp:inline>
-        </w:drawing>
-      </w:r>
-      <w:r>
-        <w:rPr>
-          <w:rtl w:val="0"/>
-        </w:rPr>
-      </w:r>
-    </w:p>
-    <w:p xmlns:wp14="http://schemas.microsoft.com/office/word/2010/wordml" wp14:textId="77777777">
-      <w:pPr>
-        <w:numPr>
-          <w:ilvl w:val="1"/>
-          <w:numId w:val="1"/>
-        </w:numPr>
-        <w:ind w:left="1440" w:hanging="360"/>
-        <w:rPr>
-          <w:u w:val="none"/>
-          <w:lang w:val="en-US"/>
-        </w:rPr>
-      </w:pPr>
-      <w:r>
-        <w:rPr>
-          <w:rFonts w:ascii="Arial Unicode MS" w:hAnsi="Arial Unicode MS" w:eastAsia="Arial Unicode MS" w:cs="Arial Unicode MS"/>
-          <w:lang w:val="en-US"/>
-        </w:rPr>
-        <w:t>만약 실행 시 더 높은 버전으로 실행되면 4.26 으로 실행 시 아예 실행이 안되는 상황이 발생할 수 있는데 이 경우 해당 폴더 삭제 후 2번부터 재실행한다.</w:t>
-      </w:r>
-    </w:p>
-    <w:p xmlns:wp14="http://schemas.microsoft.com/office/word/2010/wordml" wp14:textId="65B286E0">
-      <w:pPr>
-        <w:numPr>
-          <w:ilvl w:val="0"/>
-          <w:numId w:val="1"/>
-        </w:numPr>
-        <w:ind w:left="720" w:hanging="360"/>
-        <w:rPr>
-          <w:u w:val="none"/>
-          <w:lang w:val="en-US"/>
-        </w:rPr>
-      </w:pPr>
-      <w:r>
-        <w:rPr>
-          <w:rFonts w:ascii="Arial Unicode MS" w:hAnsi="Arial Unicode MS" w:eastAsia="Arial Unicode MS" w:cs="Arial Unicode MS"/>
-          <w:lang w:val="en-US"/>
-        </w:rPr>
-        <w:t>추억의</w:t>
-      </w:r>
-      <w:r>
-        <w:rPr>
-          <w:rFonts w:ascii="Arial Unicode MS" w:hAnsi="Arial Unicode MS" w:eastAsia="Arial Unicode MS" w:cs="Arial Unicode MS"/>
-          <w:lang w:val="en-US"/>
-        </w:rPr>
-        <w:t xml:space="preserve"> </w:t>
-      </w:r>
-      <w:r>
-        <w:rPr>
-          <w:rFonts w:ascii="Arial Unicode MS" w:hAnsi="Arial Unicode MS" w:eastAsia="Arial Unicode MS" w:cs="Arial Unicode MS"/>
-          <w:lang w:val="en-US"/>
-        </w:rPr>
-        <w:t>오드리가</w:t>
-      </w:r>
-      <w:r>
-        <w:rPr>
-          <w:rFonts w:ascii="Arial Unicode MS" w:hAnsi="Arial Unicode MS" w:eastAsia="Arial Unicode MS" w:cs="Arial Unicode MS"/>
-          <w:lang w:val="en-US"/>
-        </w:rPr>
-        <w:t xml:space="preserve"> </w:t>
-      </w:r>
-      <w:r>
-        <w:rPr>
-          <w:rFonts w:ascii="Arial Unicode MS" w:hAnsi="Arial Unicode MS" w:eastAsia="Arial Unicode MS" w:cs="Arial Unicode MS"/>
-          <w:lang w:val="en-US"/>
-        </w:rPr>
-        <w:t>보이면</w:t>
-      </w:r>
-      <w:r>
-        <w:rPr>
-          <w:rFonts w:ascii="Arial Unicode MS" w:hAnsi="Arial Unicode MS" w:eastAsia="Arial Unicode MS" w:cs="Arial Unicode MS"/>
-          <w:lang w:val="en-US"/>
-        </w:rPr>
-        <w:t xml:space="preserve"> </w:t>
-      </w:r>
-      <w:r>
-        <w:rPr>
-          <w:rFonts w:ascii="Arial Unicode MS" w:hAnsi="Arial Unicode MS" w:eastAsia="Arial Unicode MS" w:cs="Arial Unicode MS"/>
-          <w:lang w:val="en-US"/>
-        </w:rPr>
-        <w:t>성공</w:t>
-      </w:r>
-      <w:r>
-        <w:rPr>
-          <w:rFonts w:ascii="Arial Unicode MS" w:hAnsi="Arial Unicode MS" w:eastAsia="Arial Unicode MS" w:cs="Arial Unicode MS"/>
-          <w:lang w:val="en-US"/>
-        </w:rPr>
-        <w:t>!</w:t>
-      </w:r>
-      <w:r>
-        <w:drawing>
-          <wp:inline xmlns:wp14="http://schemas.microsoft.com/office/word/2010/wordprocessingDrawing" wp14:editId="68F2740A" wp14:anchorId="32D2B30A">
-            <wp:extent cx="6076950" cy="3124200"/>
-            <wp:effectExtent l="0" t="0" r="0" b="0"/>
-            <wp:docPr id="2" name="image2.png"/>
-            <wp:cNvGraphicFramePr/>
-            <a:graphic>
-              <a:graphicData xmlns:a="http://schemas.openxmlformats.org/drawingml/2006/main" uri="http://schemas.openxmlformats.org/drawingml/2006/picture">
-                <pic:pic xmlns:pic="http://schemas.openxmlformats.org/drawingml/2006/picture">
-                  <pic:nvPicPr>
-                    <pic:cNvPr id="0" name="image2.png"/>
-                    <pic:cNvPicPr preferRelativeResize="0"/>
-                  </pic:nvPicPr>
-                  <pic:blipFill>
-                    <a:blip xmlns:r="http://schemas.openxmlformats.org/officeDocument/2006/relationships" r:embed="rId7"/>
-                    <a:srcRect l="0" t="0" r="0" b="0"/>
-                    <a:stretch>
-                      <a:fillRect/>
-                    </a:stretch>
-                  </pic:blipFill>
-                  <pic:spPr>
-                    <a:xfrm>
-                      <a:off x="0" y="0"/>
-                      <a:ext cx="6076950" cy="3124200"/>
-                    </a:xfrm>
-                    <a:prstGeom prst="rect"/>
-                    <a:ln/>
-                  </pic:spPr>
-                </pic:pic>
-              </a:graphicData>
-            </a:graphic>
-          </wp:inline>
-        </w:drawing>
-      </w:r>
-      <w:r>
-        <w:rPr>
-          <w:rtl w:val="0"/>
-        </w:rPr>
-      </w:r>
-    </w:p>
-    <w:p xmlns:wp14="http://schemas.microsoft.com/office/word/2010/wordml" wp14:textId="77777777">
-      <w:pPr>
-        <w:numPr>
-          <w:ilvl w:val="1"/>
-          <w:numId w:val="1"/>
-        </w:numPr>
-        <w:ind w:left="1440" w:hanging="360"/>
-        <w:rPr>
-          <w:u w:val="none"/>
-          <w:lang w:val="en-US"/>
-        </w:rPr>
-      </w:pPr>
-      <w:r>
-        <w:rPr>
-          <w:rFonts w:ascii="Arial Unicode MS" w:hAnsi="Arial Unicode MS" w:eastAsia="Arial Unicode MS" w:cs="Arial Unicode MS"/>
-          <w:lang w:val="en-US"/>
-        </w:rPr>
-        <w:t>와 엔진 역체감 장난 아니네요</w:t>
-      </w:r>
-    </w:p>
-    <w:p xmlns:wp14="http://schemas.microsoft.com/office/word/2010/wordml" wp14:textId="77777777">
-      <w:pPr>
-        <w:numPr>
-          <w:ilvl w:val="1"/>
-          <w:numId w:val="1"/>
-        </w:numPr>
-        <w:ind w:left="1440" w:hanging="360"/>
-        <w:rPr>
-          <w:u w:val="none"/>
-        </w:rPr>
-      </w:pPr>
-      <w:r>
-        <w:rPr>
-          <w:rFonts w:ascii="Arial Unicode MS" w:hAnsi="Arial Unicode MS" w:eastAsia="Arial Unicode MS" w:cs="Arial Unicode MS"/>
-          <w:rtl w:val="0"/>
-        </w:rPr>
-        <w:t xml:space="preserve">ue4 이렇게 구렸나… ㅋㅋㅋ</w:t>
-      </w:r>
-    </w:p>
-    <w:p xmlns:wp14="http://schemas.microsoft.com/office/word/2010/wordml" wp14:textId="77777777">
-      <w:pPr/>
+    <w:p xmlns:wp14="http://schemas.microsoft.com/office/word/2010/wordml" wp14:textId="5D760E82">
       <w:r>
         <w:rPr>
           <w:lang w:val="en-US"/>
         </w:rPr>
-        <w:t>동기화 테스트 수정 완료: 2026-09-01 10:31:44</w:t>
-      </w:r>
-    </w:p>
-    <w:p xmlns:wp14="http://schemas.microsoft.com/office/word/2010/wordml" wp14:textId="77777777">
-      <w:pPr/>
-      <w:r>
-        <w:rPr>
-          <w:lang w:val="en-US"/>
-        </w:rPr>
-        <w:t>자동 확인 동기화 테스트: 2026-09-01 11:07:50</w:t>
-      </w:r>
-    </w:p>
-    <w:p>
-      <w:r>
-        <w:t>동기화 테스트용 로컬 수정입니다. (2026-09-01 11:20:38)</w:t>
-      </w:r>
-    </w:p>
-    <w:p>
-      <w:r>
-        <w:t>버튼 높이 수정 후 동기화 테스트입니다. (2026-09-01 11:24:16)</w:t>
-      </w:r>
-    </w:p>
-    <w:p>
-      <w:r>
-        <w:t>자동 재열기 수정 후 동기화 테스트입니다. (2026-09-01 11:29:42)</w:t>
-      </w:r>
-    </w:p>
-    <w:p>
-      <w:r>
-        <w:t>팝업 버튼 정렬 및 대기 시간 수정 확인용 테스트입니다. (2026-09-01 11:35:22)</w:t>
-      </w:r>
-    </w:p>
-    <w:p>
-      <w:r>
-        <w:t>웹 잠금 해제 후 60초 자동 종료 테스트입니다. (2026-09-01 11:41:04)</w:t>
+        <w:t>BluePage 테스트용 샘플 문서</w:t>
       </w:r>
     </w:p>
     <w:sectPr>

</xml_diff>